<commit_message>
merge: vLLM task 노트 중복 파일 정리
Task 1/2/3 각각 이름 정규화 시 충돌했던 두 버전을 내용 비교 후
완성본만 남기고 이전 초안 삭제 (task-2는 완성본 내용으로 교체).

Co-Authored-By: Claude Sonnet 5 <noreply@anthropic.com>
</commit_message>
<xml_diff>
--- a/topics/개발자-유미-vllm-llm-서빙-(동영상-9개)/task-2-llama3-다운로드.docx
+++ b/topics/개발자-유미-vllm-llm-서빙-(동영상-9개)/task-2-llama3-다운로드.docx
@@ -42,7 +42,7 @@
         <w:rPr>
           <w:rtl w:val="0"/>
         </w:rPr>
-        <w:t xml:space="preserve">Updated: 2025-03-24 (Mon)</w:t>
+        <w:t xml:space="preserve">Updated: 2025-03-26 (Wed)</w:t>
       </w:r>
     </w:p>
     <w:p>
@@ -537,12 +537,12 @@
           <wp:inline distB="114300" distT="114300" distL="114300" distR="114300">
             <wp:extent cx="2048634" cy="5463025"/>
             <wp:effectExtent b="0" l="0" r="0" t="0"/>
-            <wp:docPr id="13" name="image11.png"/>
+            <wp:docPr id="13" name="image9.png"/>
             <a:graphic>
               <a:graphicData uri="http://schemas.openxmlformats.org/drawingml/2006/picture">
                 <pic:pic>
                   <pic:nvPicPr>
-                    <pic:cNvPr id="0" name="image11.png"/>
+                    <pic:cNvPr id="0" name="image9.png"/>
                     <pic:cNvPicPr preferRelativeResize="0"/>
                   </pic:nvPicPr>
                   <pic:blipFill>
@@ -604,12 +604,12 @@
           <wp:inline distB="114300" distT="114300" distL="114300" distR="114300">
             <wp:extent cx="5943600" cy="1968500"/>
             <wp:effectExtent b="0" l="0" r="0" t="0"/>
-            <wp:docPr id="12" name="image2.png"/>
+            <wp:docPr id="12" name="image15.png"/>
             <a:graphic>
               <a:graphicData uri="http://schemas.openxmlformats.org/drawingml/2006/picture">
                 <pic:pic>
                   <pic:nvPicPr>
-                    <pic:cNvPr id="0" name="image2.png"/>
+                    <pic:cNvPr id="0" name="image15.png"/>
                     <pic:cNvPicPr preferRelativeResize="0"/>
                   </pic:nvPicPr>
                   <pic:blipFill>
@@ -671,12 +671,12 @@
           <wp:inline distB="114300" distT="114300" distL="114300" distR="114300">
             <wp:extent cx="5943600" cy="2425700"/>
             <wp:effectExtent b="0" l="0" r="0" t="0"/>
-            <wp:docPr id="22" name="image17.png"/>
+            <wp:docPr id="22" name="image22.png"/>
             <a:graphic>
               <a:graphicData uri="http://schemas.openxmlformats.org/drawingml/2006/picture">
                 <pic:pic>
                   <pic:nvPicPr>
-                    <pic:cNvPr id="0" name="image17.png"/>
+                    <pic:cNvPr id="0" name="image22.png"/>
                     <pic:cNvPicPr preferRelativeResize="0"/>
                   </pic:nvPicPr>
                   <pic:blipFill>
@@ -879,12 +879,12 @@
           <wp:inline distB="114300" distT="114300" distL="114300" distR="114300">
             <wp:extent cx="5943600" cy="3416300"/>
             <wp:effectExtent b="0" l="0" r="0" t="0"/>
-            <wp:docPr id="3" name="image1.png"/>
+            <wp:docPr id="3" name="image14.png"/>
             <a:graphic>
               <a:graphicData uri="http://schemas.openxmlformats.org/drawingml/2006/picture">
                 <pic:pic>
                   <pic:nvPicPr>
-                    <pic:cNvPr id="0" name="image1.png"/>
+                    <pic:cNvPr id="0" name="image14.png"/>
                     <pic:cNvPicPr preferRelativeResize="0"/>
                   </pic:nvPicPr>
                   <pic:blipFill>
@@ -946,12 +946,12 @@
           <wp:inline distB="114300" distT="114300" distL="114300" distR="114300">
             <wp:extent cx="5943600" cy="1270000"/>
             <wp:effectExtent b="0" l="0" r="0" t="0"/>
-            <wp:docPr id="4" name="image14.png"/>
+            <wp:docPr id="4" name="image1.png"/>
             <a:graphic>
               <a:graphicData uri="http://schemas.openxmlformats.org/drawingml/2006/picture">
                 <pic:pic>
                   <pic:nvPicPr>
-                    <pic:cNvPr id="0" name="image14.png"/>
+                    <pic:cNvPr id="0" name="image1.png"/>
                     <pic:cNvPicPr preferRelativeResize="0"/>
                   </pic:nvPicPr>
                   <pic:blipFill>
@@ -1013,12 +1013,12 @@
           <wp:inline distB="114300" distT="114300" distL="114300" distR="114300">
             <wp:extent cx="5943600" cy="596900"/>
             <wp:effectExtent b="0" l="0" r="0" t="0"/>
-            <wp:docPr id="7" name="image15.png"/>
+            <wp:docPr id="7" name="image11.png"/>
             <a:graphic>
               <a:graphicData uri="http://schemas.openxmlformats.org/drawingml/2006/picture">
                 <pic:pic>
                   <pic:nvPicPr>
-                    <pic:cNvPr id="0" name="image15.png"/>
+                    <pic:cNvPr id="0" name="image11.png"/>
                     <pic:cNvPicPr preferRelativeResize="0"/>
                   </pic:nvPicPr>
                   <pic:blipFill>
@@ -1061,16 +1061,6 @@
           <w:rtl w:val="0"/>
         </w:rPr>
         <w:t xml:space="preserve">VM에서 실행</w:t>
-      </w:r>
-    </w:p>
-    <w:p>
-      <w:pPr>
-        <w:rPr/>
-      </w:pPr>
-      <w:r>
-        <w:rPr>
-          <w:rtl w:val="0"/>
-        </w:rPr>
       </w:r>
     </w:p>
     <w:tbl>
@@ -1370,47 +1360,47 @@
                 <w:szCs w:val="18"/>
                 <w:rtl w:val="0"/>
               </w:rPr>
-              <w:t xml:space="preserve">(base) jupyter@tkim-instance-t4gpu-vllm-test:~$ mkdir my_model</w:t>
-            </w:r>
-          </w:p>
-          <w:p>
-            <w:pPr>
-              <w:widowControl w:val="0"/>
-              <w:spacing w:line="240" w:lineRule="auto"/>
-              <w:rPr>
-                <w:rFonts w:ascii="Courier New" w:cs="Courier New" w:eastAsia="Courier New" w:hAnsi="Courier New"/>
-                <w:sz w:val="18"/>
-                <w:szCs w:val="18"/>
-              </w:rPr>
-            </w:pPr>
-            <w:r>
-              <w:rPr>
-                <w:rFonts w:ascii="Courier New" w:cs="Courier New" w:eastAsia="Courier New" w:hAnsi="Courier New"/>
-                <w:sz w:val="18"/>
-                <w:szCs w:val="18"/>
-                <w:rtl w:val="0"/>
-              </w:rPr>
-              <w:t xml:space="preserve">(base) jupyter@tkim-instance-t4gpu-vllm-test:~$ cd my_model/</w:t>
-            </w:r>
-          </w:p>
-          <w:p>
-            <w:pPr>
-              <w:widowControl w:val="0"/>
-              <w:spacing w:line="240" w:lineRule="auto"/>
-              <w:rPr>
-                <w:rFonts w:ascii="Courier New" w:cs="Courier New" w:eastAsia="Courier New" w:hAnsi="Courier New"/>
-                <w:sz w:val="18"/>
-                <w:szCs w:val="18"/>
-              </w:rPr>
-            </w:pPr>
-            <w:r>
-              <w:rPr>
-                <w:rFonts w:ascii="Courier New" w:cs="Courier New" w:eastAsia="Courier New" w:hAnsi="Courier New"/>
-                <w:sz w:val="18"/>
-                <w:szCs w:val="18"/>
-                <w:rtl w:val="0"/>
-              </w:rPr>
-              <w:t xml:space="preserve">(base) jupyter@tkim-instance-t4gpu-vllm-test:~/my_model$ git clone https://huggingface.co/meta-llama/Meta-Llama-3.1-8B-Instruct</w:t>
+              <w:t xml:space="preserve">(base) jupyter@tkim-instance-l4gpu-vllm-test:~$ mkdir my_model</w:t>
+            </w:r>
+          </w:p>
+          <w:p>
+            <w:pPr>
+              <w:widowControl w:val="0"/>
+              <w:spacing w:line="240" w:lineRule="auto"/>
+              <w:rPr>
+                <w:rFonts w:ascii="Courier New" w:cs="Courier New" w:eastAsia="Courier New" w:hAnsi="Courier New"/>
+                <w:sz w:val="18"/>
+                <w:szCs w:val="18"/>
+              </w:rPr>
+            </w:pPr>
+            <w:r>
+              <w:rPr>
+                <w:rFonts w:ascii="Courier New" w:cs="Courier New" w:eastAsia="Courier New" w:hAnsi="Courier New"/>
+                <w:sz w:val="18"/>
+                <w:szCs w:val="18"/>
+                <w:rtl w:val="0"/>
+              </w:rPr>
+              <w:t xml:space="preserve">(base) jupyter@tkim-instance-l4gpu-vllm-test:~$ cd my_model/</w:t>
+            </w:r>
+          </w:p>
+          <w:p>
+            <w:pPr>
+              <w:widowControl w:val="0"/>
+              <w:spacing w:line="240" w:lineRule="auto"/>
+              <w:rPr>
+                <w:rFonts w:ascii="Courier New" w:cs="Courier New" w:eastAsia="Courier New" w:hAnsi="Courier New"/>
+                <w:sz w:val="18"/>
+                <w:szCs w:val="18"/>
+              </w:rPr>
+            </w:pPr>
+            <w:r>
+              <w:rPr>
+                <w:rFonts w:ascii="Courier New" w:cs="Courier New" w:eastAsia="Courier New" w:hAnsi="Courier New"/>
+                <w:sz w:val="18"/>
+                <w:szCs w:val="18"/>
+                <w:rtl w:val="0"/>
+              </w:rPr>
+              <w:t xml:space="preserve">(base) jupyter@tkim-instance-l4gpu-vllm-test:~/my_model$ git clone https://huggingface.co/meta-llama/Meta-Llama-3.1-8B-Instruct</w:t>
             </w:r>
           </w:p>
         </w:tc>
@@ -1623,7 +1613,7 @@
                 <w:szCs w:val="18"/>
                 <w:rtl w:val="0"/>
               </w:rPr>
-              <w:t xml:space="preserve">Receiving objects: 100% (109/109), 2.28 MiB | 12.70 MiB/s, done.</w:t>
+              <w:t xml:space="preserve">Receiving objects: 100% (109/109), 2.28 MiB | 19.64 MiB/s, done.</w:t>
             </w:r>
           </w:p>
           <w:p>
@@ -1698,28 +1688,168 @@
             </w:pPr>
             <w:r>
               <w:rPr>
-                <w:rtl w:val="0"/>
-              </w:rPr>
-            </w:r>
-          </w:p>
-          <w:p>
-            <w:pPr>
-              <w:widowControl w:val="0"/>
-              <w:spacing w:line="240" w:lineRule="auto"/>
-              <w:rPr>
-                <w:rFonts w:ascii="Courier New" w:cs="Courier New" w:eastAsia="Courier New" w:hAnsi="Courier New"/>
-                <w:sz w:val="18"/>
-                <w:szCs w:val="18"/>
-              </w:rPr>
-            </w:pPr>
-            <w:r>
-              <w:rPr>
-                <w:rFonts w:ascii="Courier New" w:cs="Courier New" w:eastAsia="Courier New" w:hAnsi="Courier New"/>
-                <w:sz w:val="18"/>
-                <w:szCs w:val="18"/>
-                <w:rtl w:val="0"/>
-              </w:rPr>
-              <w:t xml:space="preserve">Filtering content:  83% (5/6), 2.95 GiB | 12.90 MiB/s</w:t>
+                <w:rFonts w:ascii="Courier New" w:cs="Courier New" w:eastAsia="Courier New" w:hAnsi="Courier New"/>
+                <w:sz w:val="18"/>
+                <w:szCs w:val="18"/>
+                <w:rtl w:val="0"/>
+              </w:rPr>
+              <w:t xml:space="preserve">Filtering content: 100% (6/6), 5.91 GiB | 35.26 MiB/s, done.</w:t>
+            </w:r>
+          </w:p>
+          <w:p>
+            <w:pPr>
+              <w:widowControl w:val="0"/>
+              <w:spacing w:line="240" w:lineRule="auto"/>
+              <w:rPr>
+                <w:rFonts w:ascii="Courier New" w:cs="Courier New" w:eastAsia="Courier New" w:hAnsi="Courier New"/>
+                <w:sz w:val="18"/>
+                <w:szCs w:val="18"/>
+              </w:rPr>
+            </w:pPr>
+            <w:r>
+              <w:rPr>
+                <w:rFonts w:ascii="Courier New" w:cs="Courier New" w:eastAsia="Courier New" w:hAnsi="Courier New"/>
+                <w:sz w:val="18"/>
+                <w:szCs w:val="18"/>
+                <w:rtl w:val="0"/>
+              </w:rPr>
+              <w:t xml:space="preserve">Encountered 4 file(s) that may not have been copied correctly on Windows:</w:t>
+            </w:r>
+          </w:p>
+          <w:p>
+            <w:pPr>
+              <w:widowControl w:val="0"/>
+              <w:spacing w:line="240" w:lineRule="auto"/>
+              <w:rPr>
+                <w:rFonts w:ascii="Courier New" w:cs="Courier New" w:eastAsia="Courier New" w:hAnsi="Courier New"/>
+                <w:sz w:val="18"/>
+                <w:szCs w:val="18"/>
+              </w:rPr>
+            </w:pPr>
+            <w:r>
+              <w:rPr>
+                <w:rFonts w:ascii="Courier New" w:cs="Courier New" w:eastAsia="Courier New" w:hAnsi="Courier New"/>
+                <w:sz w:val="18"/>
+                <w:szCs w:val="18"/>
+                <w:rtl w:val="0"/>
+              </w:rPr>
+              <w:t xml:space="preserve">        model-00003-of-00004.safetensors</w:t>
+            </w:r>
+          </w:p>
+          <w:p>
+            <w:pPr>
+              <w:widowControl w:val="0"/>
+              <w:spacing w:line="240" w:lineRule="auto"/>
+              <w:rPr>
+                <w:rFonts w:ascii="Courier New" w:cs="Courier New" w:eastAsia="Courier New" w:hAnsi="Courier New"/>
+                <w:sz w:val="18"/>
+                <w:szCs w:val="18"/>
+              </w:rPr>
+            </w:pPr>
+            <w:r>
+              <w:rPr>
+                <w:rFonts w:ascii="Courier New" w:cs="Courier New" w:eastAsia="Courier New" w:hAnsi="Courier New"/>
+                <w:sz w:val="18"/>
+                <w:szCs w:val="18"/>
+                <w:rtl w:val="0"/>
+              </w:rPr>
+              <w:t xml:space="preserve">        model-00001-of-00004.safetensors</w:t>
+            </w:r>
+          </w:p>
+          <w:p>
+            <w:pPr>
+              <w:widowControl w:val="0"/>
+              <w:spacing w:line="240" w:lineRule="auto"/>
+              <w:rPr>
+                <w:rFonts w:ascii="Courier New" w:cs="Courier New" w:eastAsia="Courier New" w:hAnsi="Courier New"/>
+                <w:sz w:val="18"/>
+                <w:szCs w:val="18"/>
+              </w:rPr>
+            </w:pPr>
+            <w:r>
+              <w:rPr>
+                <w:rFonts w:ascii="Courier New" w:cs="Courier New" w:eastAsia="Courier New" w:hAnsi="Courier New"/>
+                <w:sz w:val="18"/>
+                <w:szCs w:val="18"/>
+                <w:rtl w:val="0"/>
+              </w:rPr>
+              <w:t xml:space="preserve">        model-00002-of-00004.safetensors</w:t>
+            </w:r>
+          </w:p>
+          <w:p>
+            <w:pPr>
+              <w:widowControl w:val="0"/>
+              <w:spacing w:line="240" w:lineRule="auto"/>
+              <w:rPr>
+                <w:rFonts w:ascii="Courier New" w:cs="Courier New" w:eastAsia="Courier New" w:hAnsi="Courier New"/>
+                <w:sz w:val="18"/>
+                <w:szCs w:val="18"/>
+              </w:rPr>
+            </w:pPr>
+            <w:r>
+              <w:rPr>
+                <w:rFonts w:ascii="Courier New" w:cs="Courier New" w:eastAsia="Courier New" w:hAnsi="Courier New"/>
+                <w:sz w:val="18"/>
+                <w:szCs w:val="18"/>
+                <w:rtl w:val="0"/>
+              </w:rPr>
+              <w:t xml:space="preserve">        original/consolidated.00.pth</w:t>
+            </w:r>
+          </w:p>
+          <w:p>
+            <w:pPr>
+              <w:widowControl w:val="0"/>
+              <w:spacing w:line="240" w:lineRule="auto"/>
+              <w:rPr>
+                <w:rFonts w:ascii="Courier New" w:cs="Courier New" w:eastAsia="Courier New" w:hAnsi="Courier New"/>
+                <w:sz w:val="18"/>
+                <w:szCs w:val="18"/>
+              </w:rPr>
+            </w:pPr>
+            <w:r>
+              <w:rPr>
+                <w:rtl w:val="0"/>
+              </w:rPr>
+            </w:r>
+          </w:p>
+          <w:p>
+            <w:pPr>
+              <w:widowControl w:val="0"/>
+              <w:spacing w:line="240" w:lineRule="auto"/>
+              <w:rPr>
+                <w:rFonts w:ascii="Courier New" w:cs="Courier New" w:eastAsia="Courier New" w:hAnsi="Courier New"/>
+                <w:sz w:val="18"/>
+                <w:szCs w:val="18"/>
+              </w:rPr>
+            </w:pPr>
+            <w:r>
+              <w:rPr>
+                <w:rFonts w:ascii="Courier New" w:cs="Courier New" w:eastAsia="Courier New" w:hAnsi="Courier New"/>
+                <w:sz w:val="18"/>
+                <w:szCs w:val="18"/>
+                <w:rtl w:val="0"/>
+              </w:rPr>
+              <w:t xml:space="preserve">See: `git lfs help smudge` for more details.</w:t>
+            </w:r>
+          </w:p>
+          <w:p>
+            <w:pPr>
+              <w:widowControl w:val="0"/>
+              <w:spacing w:line="240" w:lineRule="auto"/>
+              <w:rPr>
+                <w:rFonts w:ascii="Courier New" w:cs="Courier New" w:eastAsia="Courier New" w:hAnsi="Courier New"/>
+                <w:sz w:val="18"/>
+                <w:szCs w:val="18"/>
+              </w:rPr>
+            </w:pPr>
+            <w:r>
+              <w:rPr>
+                <w:rFonts w:ascii="Courier New" w:cs="Courier New" w:eastAsia="Courier New" w:hAnsi="Courier New"/>
+                <w:sz w:val="18"/>
+                <w:szCs w:val="18"/>
+                <w:rtl w:val="0"/>
+              </w:rPr>
+              <w:t xml:space="preserve">(base) jupyter@tkim-instance-l4gpu-vllm-test:~/my_model$</w:t>
             </w:r>
           </w:p>
         </w:tc>
@@ -1749,11 +1879,54 @@
     </w:p>
     <w:p>
       <w:pPr>
+        <w:pStyle w:val="Heading2"/>
+        <w:rPr/>
+      </w:pPr>
+      <w:bookmarkStart w:colFirst="0" w:colLast="0" w:name="_x44bcsljokag" w:id="11"/>
+      <w:bookmarkEnd w:id="11"/>
+      <w:r>
+        <w:br w:type="page"/>
+      </w:r>
+      <w:r>
+        <w:rPr>
+          <w:rtl w:val="0"/>
+        </w:rPr>
+      </w:r>
+    </w:p>
+    <w:p>
+      <w:pPr>
+        <w:pStyle w:val="Heading2"/>
+        <w:rPr/>
+      </w:pPr>
+      <w:bookmarkStart w:colFirst="0" w:colLast="0" w:name="_8696l83dfj4v" w:id="12"/>
+      <w:bookmarkEnd w:id="12"/>
+      <w:r>
+        <w:rPr>
+          <w:rFonts w:ascii="Arial Unicode MS" w:cs="Arial Unicode MS" w:eastAsia="Arial Unicode MS" w:hAnsi="Arial Unicode MS"/>
+          <w:rtl w:val="0"/>
+        </w:rPr>
+        <w:t xml:space="preserve">부록. T4 GPU를 사용했을 때 겪은 에러</w:t>
+      </w:r>
+    </w:p>
+    <w:p>
+      <w:pPr>
+        <w:rPr/>
+      </w:pPr>
+      <w:r>
+        <w:rPr>
+          <w:rFonts w:ascii="Arial Unicode MS" w:cs="Arial Unicode MS" w:eastAsia="Arial Unicode MS" w:hAnsi="Arial Unicode MS"/>
+          <w:rtl w:val="0"/>
+        </w:rPr>
+        <w:t xml:space="preserve">결론은 T4 GPU는 사용이 불가능하고 L4 GPU를 써야한다는 것이지만 참고용으로 첨부함</w:t>
+      </w:r>
+    </w:p>
+    <w:p>
+      <w:pPr>
         <w:pStyle w:val="Heading4"/>
         <w:rPr/>
       </w:pPr>
-      <w:bookmarkStart w:colFirst="0" w:colLast="0" w:name="_fvzv59jnabn8" w:id="11"/>
-      <w:bookmarkEnd w:id="11"/>
+      <w:bookmarkStart w:colFirst="0" w:colLast="0" w:name="_fvzv59jnabn8" w:id="13"/>
+      <w:bookmarkEnd w:id="13"/>
       <w:r>
         <w:rPr>
           <w:rFonts w:ascii="Arial Unicode MS" w:cs="Arial Unicode MS" w:eastAsia="Arial Unicode MS" w:hAnsi="Arial Unicode MS"/>
@@ -1772,12 +1945,12 @@
           <wp:inline distB="114300" distT="114300" distL="114300" distR="114300">
             <wp:extent cx="5943600" cy="2362200"/>
             <wp:effectExtent b="0" l="0" r="0" t="0"/>
-            <wp:docPr id="2" name="image5.png"/>
+            <wp:docPr id="2" name="image16.png"/>
             <a:graphic>
               <a:graphicData uri="http://schemas.openxmlformats.org/drawingml/2006/picture">
                 <pic:pic>
                   <pic:nvPicPr>
-                    <pic:cNvPr id="0" name="image5.png"/>
+                    <pic:cNvPr id="0" name="image16.png"/>
                     <pic:cNvPicPr preferRelativeResize="0"/>
                   </pic:nvPicPr>
                   <pic:blipFill>
@@ -1829,12 +2002,12 @@
           <wp:inline distB="114300" distT="114300" distL="114300" distR="114300">
             <wp:extent cx="1960068" cy="946005"/>
             <wp:effectExtent b="0" l="0" r="0" t="0"/>
-            <wp:docPr id="10" name="image3.png"/>
+            <wp:docPr id="10" name="image7.png"/>
             <a:graphic>
               <a:graphicData uri="http://schemas.openxmlformats.org/drawingml/2006/picture">
                 <pic:pic>
                   <pic:nvPicPr>
-                    <pic:cNvPr id="0" name="image3.png"/>
+                    <pic:cNvPr id="0" name="image7.png"/>
                     <pic:cNvPicPr preferRelativeResize="0"/>
                   </pic:nvPicPr>
                   <pic:blipFill>
@@ -1869,8 +2042,8 @@
         <w:pStyle w:val="Heading4"/>
         <w:rPr/>
       </w:pPr>
-      <w:bookmarkStart w:colFirst="0" w:colLast="0" w:name="_9umpy2gvu5y7" w:id="12"/>
-      <w:bookmarkEnd w:id="12"/>
+      <w:bookmarkStart w:colFirst="0" w:colLast="0" w:name="_9umpy2gvu5y7" w:id="14"/>
+      <w:bookmarkEnd w:id="14"/>
       <w:r>
         <w:rPr>
           <w:rFonts w:ascii="Arial Unicode MS" w:cs="Arial Unicode MS" w:eastAsia="Arial Unicode MS" w:hAnsi="Arial Unicode MS"/>
@@ -3858,12 +4031,12 @@
           <wp:inline distB="114300" distT="114300" distL="114300" distR="114300">
             <wp:extent cx="5105400" cy="1066800"/>
             <wp:effectExtent b="0" l="0" r="0" t="0"/>
-            <wp:docPr id="14" name="image4.png"/>
+            <wp:docPr id="14" name="image5.png"/>
             <a:graphic>
               <a:graphicData uri="http://schemas.openxmlformats.org/drawingml/2006/picture">
                 <pic:pic>
                   <pic:nvPicPr>
-                    <pic:cNvPr id="0" name="image4.png"/>
+                    <pic:cNvPr id="0" name="image5.png"/>
                     <pic:cNvPicPr preferRelativeResize="0"/>
                   </pic:nvPicPr>
                   <pic:blipFill>
@@ -3915,12 +4088,12 @@
           <wp:inline distB="114300" distT="114300" distL="114300" distR="114300">
             <wp:extent cx="5091113" cy="2278252"/>
             <wp:effectExtent b="0" l="0" r="0" t="0"/>
-            <wp:docPr id="1" name="image20.png"/>
+            <wp:docPr id="1" name="image2.png"/>
             <a:graphic>
               <a:graphicData uri="http://schemas.openxmlformats.org/drawingml/2006/picture">
                 <pic:pic>
                   <pic:nvPicPr>
-                    <pic:cNvPr id="0" name="image20.png"/>
+                    <pic:cNvPr id="0" name="image2.png"/>
                     <pic:cNvPicPr preferRelativeResize="0"/>
                   </pic:nvPicPr>
                   <pic:blipFill>
@@ -3982,12 +4155,12 @@
           <wp:inline distB="114300" distT="114300" distL="114300" distR="114300">
             <wp:extent cx="5943600" cy="6019800"/>
             <wp:effectExtent b="0" l="0" r="0" t="0"/>
-            <wp:docPr id="5" name="image12.png"/>
+            <wp:docPr id="5" name="image17.png"/>
             <a:graphic>
               <a:graphicData uri="http://schemas.openxmlformats.org/drawingml/2006/picture">
                 <pic:pic>
                   <pic:nvPicPr>
-                    <pic:cNvPr id="0" name="image12.png"/>
+                    <pic:cNvPr id="0" name="image17.png"/>
                     <pic:cNvPicPr preferRelativeResize="0"/>
                   </pic:nvPicPr>
                   <pic:blipFill>
@@ -4116,12 +4289,12 @@
           <wp:inline distB="114300" distT="114300" distL="114300" distR="114300">
             <wp:extent cx="4119563" cy="3677238"/>
             <wp:effectExtent b="0" l="0" r="0" t="0"/>
-            <wp:docPr id="11" name="image16.png"/>
+            <wp:docPr id="11" name="image12.png"/>
             <a:graphic>
               <a:graphicData uri="http://schemas.openxmlformats.org/drawingml/2006/picture">
                 <pic:pic>
                   <pic:nvPicPr>
-                    <pic:cNvPr id="0" name="image16.png"/>
+                    <pic:cNvPr id="0" name="image12.png"/>
                     <pic:cNvPicPr preferRelativeResize="0"/>
                   </pic:nvPicPr>
                   <pic:blipFill>
@@ -4161,12 +4334,12 @@
           <wp:inline distB="114300" distT="114300" distL="114300" distR="114300">
             <wp:extent cx="4319588" cy="3793484"/>
             <wp:effectExtent b="0" l="0" r="0" t="0"/>
-            <wp:docPr id="19" name="image13.png"/>
+            <wp:docPr id="19" name="image19.png"/>
             <a:graphic>
               <a:graphicData uri="http://schemas.openxmlformats.org/drawingml/2006/picture">
                 <pic:pic>
                   <pic:nvPicPr>
-                    <pic:cNvPr id="0" name="image13.png"/>
+                    <pic:cNvPr id="0" name="image19.png"/>
                     <pic:cNvPicPr preferRelativeResize="0"/>
                   </pic:nvPicPr>
                   <pic:blipFill>
@@ -4226,12 +4399,12 @@
           <wp:inline distB="114300" distT="114300" distL="114300" distR="114300">
             <wp:extent cx="5943600" cy="2006600"/>
             <wp:effectExtent b="0" l="0" r="0" t="0"/>
-            <wp:docPr id="23" name="image19.png"/>
+            <wp:docPr id="23" name="image21.png"/>
             <a:graphic>
               <a:graphicData uri="http://schemas.openxmlformats.org/drawingml/2006/picture">
                 <pic:pic>
                   <pic:nvPicPr>
-                    <pic:cNvPr id="0" name="image19.png"/>
+                    <pic:cNvPr id="0" name="image21.png"/>
                     <pic:cNvPicPr preferRelativeResize="0"/>
                   </pic:nvPicPr>
                   <pic:blipFill>
@@ -4293,12 +4466,12 @@
           <wp:inline distB="114300" distT="114300" distL="114300" distR="114300">
             <wp:extent cx="5943600" cy="1993900"/>
             <wp:effectExtent b="0" l="0" r="0" t="0"/>
-            <wp:docPr id="15" name="image7.png"/>
+            <wp:docPr id="15" name="image3.png"/>
             <a:graphic>
               <a:graphicData uri="http://schemas.openxmlformats.org/drawingml/2006/picture">
                 <pic:pic>
                   <pic:nvPicPr>
-                    <pic:cNvPr id="0" name="image7.png"/>
+                    <pic:cNvPr id="0" name="image3.png"/>
                     <pic:cNvPicPr preferRelativeResize="0"/>
                   </pic:nvPicPr>
                   <pic:blipFill>
@@ -4343,8 +4516,8 @@
         <w:pStyle w:val="Heading4"/>
         <w:rPr/>
       </w:pPr>
-      <w:bookmarkStart w:colFirst="0" w:colLast="0" w:name="_3dp9865v5prn" w:id="13"/>
-      <w:bookmarkEnd w:id="13"/>
+      <w:bookmarkStart w:colFirst="0" w:colLast="0" w:name="_3dp9865v5prn" w:id="15"/>
+      <w:bookmarkEnd w:id="15"/>
       <w:r>
         <w:rPr>
           <w:rtl w:val="0"/>
@@ -4357,8 +4530,8 @@
         <w:pStyle w:val="Heading5"/>
         <w:rPr/>
       </w:pPr>
-      <w:bookmarkStart w:colFirst="0" w:colLast="0" w:name="_bvz462gw7y3y" w:id="14"/>
-      <w:bookmarkEnd w:id="14"/>
+      <w:bookmarkStart w:colFirst="0" w:colLast="0" w:name="_bvz462gw7y3y" w:id="16"/>
+      <w:bookmarkEnd w:id="16"/>
       <w:r>
         <w:rPr>
           <w:rFonts w:ascii="Arial Unicode MS" w:cs="Arial Unicode MS" w:eastAsia="Arial Unicode MS" w:hAnsi="Arial Unicode MS"/>
@@ -4389,12 +4562,12 @@
           <wp:inline distB="114300" distT="114300" distL="114300" distR="114300">
             <wp:extent cx="5181600" cy="381000"/>
             <wp:effectExtent b="0" l="0" r="0" t="0"/>
-            <wp:docPr id="21" name="image18.png"/>
+            <wp:docPr id="21" name="image20.png"/>
             <a:graphic>
               <a:graphicData uri="http://schemas.openxmlformats.org/drawingml/2006/picture">
                 <pic:pic>
                   <pic:nvPicPr>
-                    <pic:cNvPr id="0" name="image18.png"/>
+                    <pic:cNvPr id="0" name="image20.png"/>
                     <pic:cNvPicPr preferRelativeResize="0"/>
                   </pic:nvPicPr>
                   <pic:blipFill>
@@ -4446,12 +4619,12 @@
           <wp:inline distB="114300" distT="114300" distL="114300" distR="114300">
             <wp:extent cx="5943600" cy="863600"/>
             <wp:effectExtent b="0" l="0" r="0" t="0"/>
-            <wp:docPr id="20" name="image9.png"/>
+            <wp:docPr id="20" name="image18.png"/>
             <a:graphic>
               <a:graphicData uri="http://schemas.openxmlformats.org/drawingml/2006/picture">
                 <pic:pic>
                   <pic:nvPicPr>
-                    <pic:cNvPr id="0" name="image9.png"/>
+                    <pic:cNvPr id="0" name="image18.png"/>
                     <pic:cNvPicPr preferRelativeResize="0"/>
                   </pic:nvPicPr>
                   <pic:blipFill>
@@ -4511,14 +4684,14 @@
         <w:rPr/>
         <w:drawing>
           <wp:inline distB="114300" distT="114300" distL="114300" distR="114300">
-            <wp:extent cx="5915025" cy="2257425"/>
+            <wp:extent cx="4700588" cy="1793944"/>
             <wp:effectExtent b="0" l="0" r="0" t="0"/>
-            <wp:docPr id="8" name="image21.png"/>
+            <wp:docPr id="8" name="image4.png"/>
             <a:graphic>
               <a:graphicData uri="http://schemas.openxmlformats.org/drawingml/2006/picture">
                 <pic:pic>
                   <pic:nvPicPr>
-                    <pic:cNvPr id="0" name="image21.png"/>
+                    <pic:cNvPr id="0" name="image4.png"/>
                     <pic:cNvPicPr preferRelativeResize="0"/>
                   </pic:nvPicPr>
                   <pic:blipFill>
@@ -4531,7 +4704,7 @@
                   <pic:spPr>
                     <a:xfrm>
                       <a:off x="0" y="0"/>
-                      <a:ext cx="5915025" cy="2257425"/>
+                      <a:ext cx="4700588" cy="1793944"/>
                     </a:xfrm>
                     <a:prstGeom prst="rect"/>
                     <a:ln/>
@@ -4564,16 +4737,6 @@
       </w:pPr>
       <w:r>
         <w:rPr>
-          <w:rtl w:val="0"/>
-        </w:rPr>
-      </w:r>
-    </w:p>
-    <w:p>
-      <w:pPr>
-        <w:rPr/>
-      </w:pPr>
-      <w:r>
-        <w:rPr>
           <w:rFonts w:ascii="Arial Unicode MS" w:cs="Arial Unicode MS" w:eastAsia="Arial Unicode MS" w:hAnsi="Arial Unicode MS"/>
           <w:rtl w:val="0"/>
         </w:rPr>
@@ -4590,12 +4753,12 @@
           <wp:inline distB="114300" distT="114300" distL="114300" distR="114300">
             <wp:extent cx="5105400" cy="685800"/>
             <wp:effectExtent b="0" l="0" r="0" t="0"/>
-            <wp:docPr id="18" name="image22.png"/>
+            <wp:docPr id="18" name="image10.png"/>
             <a:graphic>
               <a:graphicData uri="http://schemas.openxmlformats.org/drawingml/2006/picture">
                 <pic:pic>
                   <pic:nvPicPr>
-                    <pic:cNvPr id="0" name="image22.png"/>
+                    <pic:cNvPr id="0" name="image10.png"/>
                     <pic:cNvPicPr preferRelativeResize="0"/>
                   </pic:nvPicPr>
                   <pic:blipFill>
@@ -4647,12 +4810,12 @@
           <wp:inline distB="114300" distT="114300" distL="114300" distR="114300">
             <wp:extent cx="5105400" cy="1066800"/>
             <wp:effectExtent b="0" l="0" r="0" t="0"/>
-            <wp:docPr id="9" name="image4.png"/>
+            <wp:docPr id="9" name="image5.png"/>
             <a:graphic>
               <a:graphicData uri="http://schemas.openxmlformats.org/drawingml/2006/picture">
                 <pic:pic>
                   <pic:nvPicPr>
-                    <pic:cNvPr id="0" name="image4.png"/>
+                    <pic:cNvPr id="0" name="image5.png"/>
                     <pic:cNvPicPr preferRelativeResize="0"/>
                   </pic:nvPicPr>
                   <pic:blipFill>
@@ -4704,12 +4867,12 @@
           <wp:inline distB="114300" distT="114300" distL="114300" distR="114300">
             <wp:extent cx="3967163" cy="2060969"/>
             <wp:effectExtent b="0" l="0" r="0" t="0"/>
-            <wp:docPr id="6" name="image10.png"/>
+            <wp:docPr id="6" name="image13.png"/>
             <a:graphic>
               <a:graphicData uri="http://schemas.openxmlformats.org/drawingml/2006/picture">
                 <pic:pic>
                   <pic:nvPicPr>
-                    <pic:cNvPr id="0" name="image10.png"/>
+                    <pic:cNvPr id="0" name="image13.png"/>
                     <pic:cNvPicPr preferRelativeResize="0"/>
                   </pic:nvPicPr>
                   <pic:blipFill>
@@ -6176,8 +6339,8 @@
         <w:pStyle w:val="Heading2"/>
         <w:rPr/>
       </w:pPr>
-      <w:bookmarkStart w:colFirst="0" w:colLast="0" w:name="_f7pe7yk81q25" w:id="15"/>
-      <w:bookmarkEnd w:id="15"/>
+      <w:bookmarkStart w:colFirst="0" w:colLast="0" w:name="_f7pe7yk81q25" w:id="17"/>
+      <w:bookmarkEnd w:id="17"/>
       <w:r>
         <w:rPr>
           <w:rFonts w:ascii="Arial Unicode MS" w:cs="Arial Unicode MS" w:eastAsia="Arial Unicode MS" w:hAnsi="Arial Unicode MS"/>

</xml_diff>